<commit_message>
Complete Chapter 2 study guides 2-1 to 2-15: Word, PDF, ZIP, checklist
Adds lessons 2-13 to 2-15, applies batch 3-4 review fixes, and includes
a README with the completion checklist and regeneration steps.

Co-Authored-By: Claude Opus 5.5 <noreply@anthropic.com>
</commit_message>
<xml_diff>
--- a/docs/study-guides/chapter-2/word/Lesson-2-02-Round-Multi-Digit-Numbers.docx
+++ b/docs/study-guides/chapter-2/word/Lesson-2-02-Round-Multi-Digit-Numbers.docx
@@ -738,7 +738,7 @@
                 <wp:inline distT="0" distB="0" distL="0" distR="0">
                   <wp:extent cx="2914650" cy="466725"/>
                   <wp:effectExtent t="0" r="0" b="0" l="0"/>
-                  <wp:docPr id="5" name="" descr="" title=""/>
+                  <wp:docPr id="15" name="" descr="" title=""/>
                   <wp:cNvGraphicFramePr>
                     <a:graphicFrameLocks xmlns:a="http://schemas.openxmlformats.org/drawingml/2006/main" noChangeAspect="1"/>
                   </wp:cNvGraphicFramePr>
@@ -894,7 +894,7 @@
                 <wp:inline distT="0" distB="0" distL="0" distR="0">
                   <wp:extent cx="2914650" cy="466725"/>
                   <wp:effectExtent t="0" r="0" b="0" l="0"/>
-                  <wp:docPr id="6" name="" descr="" title=""/>
+                  <wp:docPr id="16" name="" descr="" title=""/>
                   <wp:cNvGraphicFramePr>
                     <a:graphicFrameLocks xmlns:a="http://schemas.openxmlformats.org/drawingml/2006/main" noChangeAspect="1"/>
                   </wp:cNvGraphicFramePr>
@@ -1701,7 +1701,7 @@
                 <wp:inline distT="0" distB="0" distL="0" distR="0">
                   <wp:extent cx="4752975" cy="666750"/>
                   <wp:effectExtent t="0" r="0" b="0" l="0"/>
-                  <wp:docPr id="7" name="" descr="" title=""/>
+                  <wp:docPr id="17" name="" descr="" title=""/>
                   <wp:cNvGraphicFramePr>
                     <a:graphicFrameLocks xmlns:a="http://schemas.openxmlformats.org/drawingml/2006/main" noChangeAspect="1"/>
                   </wp:cNvGraphicFramePr>
@@ -2100,7 +2100,7 @@
                 <wp:inline distT="0" distB="0" distL="0" distR="0">
                   <wp:extent cx="4752975" cy="666750"/>
                   <wp:effectExtent t="0" r="0" b="0" l="0"/>
-                  <wp:docPr id="8" name="" descr="" title=""/>
+                  <wp:docPr id="18" name="" descr="" title=""/>
                   <wp:cNvGraphicFramePr>
                     <a:graphicFrameLocks xmlns:a="http://schemas.openxmlformats.org/drawingml/2006/main" noChangeAspect="1"/>
                   </wp:cNvGraphicFramePr>
@@ -2251,7 +2251,7 @@
                 <wp:inline distT="0" distB="0" distL="0" distR="0">
                   <wp:extent cx="4752975" cy="666750"/>
                   <wp:effectExtent t="0" r="0" b="0" l="0"/>
-                  <wp:docPr id="9" name="" descr="" title=""/>
+                  <wp:docPr id="19" name="" descr="" title=""/>
                   <wp:cNvGraphicFramePr>
                     <a:graphicFrameLocks xmlns:a="http://schemas.openxmlformats.org/drawingml/2006/main" noChangeAspect="1"/>
                   </wp:cNvGraphicFramePr>

</xml_diff>